<commit_message>
home... schreiben erste finale korektur
</commit_message>
<xml_diff>
--- a/Developer_Guide_Stitchi1.0.docx
+++ b/Developer_Guide_Stitchi1.0.docx
@@ -3871,10 +3871,7 @@
               <w:t>Number of recent hand-state samples and minimum agreeing samples for buffered/static classification. More smoothing reduces flicker but can delay transitions.</w:t>
             </w:r>
             <w:r>
-              <w:t xml:space="preserve"> For static </w:t>
-            </w:r>
-            <w:r>
-              <w:t xml:space="preserve">hand detection </w:t>
+              <w:t xml:space="preserve"> For static hand detection </w:t>
             </w:r>
             <w:r>
               <w:t>method</w:t>
@@ -4990,7 +4987,115 @@
         <w:pStyle w:val="berschrift1"/>
       </w:pPr>
       <w:r>
-        <w:t>7. MATLAB audio-system communication (UDP/JSON)</w:t>
+        <w:t>7</w:t>
+      </w:r>
+      <w:r>
+        <w:t xml:space="preserve">. Adjust hand grabbing detection </w:t>
+      </w:r>
+    </w:p>
+    <w:p/>
+    <w:p>
+      <w:r>
+        <w:t xml:space="preserve">Use </w:t>
+      </w:r>
+      <w:r>
+        <w:t>‘</w:t>
+      </w:r>
+      <w:proofErr w:type="spellStart"/>
+      <w:r>
+        <w:t>grab_detection_methode</w:t>
+      </w:r>
+      <w:proofErr w:type="spellEnd"/>
+      <w:r>
+        <w:t xml:space="preserve">’ </w:t>
+      </w:r>
+      <w:r>
+        <w:t xml:space="preserve">to set the static or dynamic hand-detection method. If you wish to modify the dynamic hand-detection method, focus on parameters </w:t>
+      </w:r>
+      <w:r>
+        <w:t>‘</w:t>
+      </w:r>
+      <w:proofErr w:type="spellStart"/>
+      <w:r>
+        <w:t>dynamic_grab_distance_difference</w:t>
+      </w:r>
+      <w:proofErr w:type="spellEnd"/>
+      <w:r>
+        <w:t>’ and ‘</w:t>
+      </w:r>
+      <w:proofErr w:type="spellStart"/>
+      <w:r>
+        <w:t>dynamic_grab_time_difference</w:t>
+      </w:r>
+      <w:proofErr w:type="spellEnd"/>
+      <w:r>
+        <w:t>’.</w:t>
+      </w:r>
+    </w:p>
+    <w:p>
+      <w:r>
+        <w:t>I</w:t>
+      </w:r>
+      <w:r>
+        <w:t xml:space="preserve">f you wish to modify the static hand-detection method, focus on parameters </w:t>
+      </w:r>
+      <w:r>
+        <w:t>‘</w:t>
+      </w:r>
+      <w:proofErr w:type="spellStart"/>
+      <w:r>
+        <w:t>hand_status_buffer_size</w:t>
+      </w:r>
+      <w:proofErr w:type="spellEnd"/>
+      <w:proofErr w:type="gramStart"/>
+      <w:r>
+        <w:t>’ ,</w:t>
+      </w:r>
+      <w:proofErr w:type="gramEnd"/>
+      <w:r>
+        <w:t xml:space="preserve"> ‘</w:t>
+      </w:r>
+      <w:proofErr w:type="spellStart"/>
+      <w:r>
+        <w:t>hand_status_buffer_atleast</w:t>
+      </w:r>
+      <w:proofErr w:type="spellEnd"/>
+      <w:proofErr w:type="gramStart"/>
+      <w:r>
+        <w:t>’, ‘</w:t>
+      </w:r>
+      <w:proofErr w:type="spellStart"/>
+      <w:proofErr w:type="gramEnd"/>
+      <w:r>
+        <w:t>hand_open_thrashold</w:t>
+      </w:r>
+      <w:proofErr w:type="spellEnd"/>
+      <w:r>
+        <w:t>’ and ‘</w:t>
+      </w:r>
+      <w:proofErr w:type="spellStart"/>
+      <w:r>
+        <w:t>hand_close_thrashold</w:t>
+      </w:r>
+      <w:proofErr w:type="spellEnd"/>
+      <w:r>
+        <w:t>’.</w:t>
+      </w:r>
+    </w:p>
+    <w:p>
+      <w:r>
+        <w:t>These are described in greater detail in section 6.</w:t>
+      </w:r>
+    </w:p>
+    <w:p>
+      <w:pPr>
+        <w:pStyle w:val="berschrift1"/>
+      </w:pPr>
+      <w:r>
+        <w:t>8</w:t>
+      </w:r>
+      <w:r>
+        <w:t>. MATLAB audio-system communication (UDP/JSON)</w:t>
       </w:r>
     </w:p>
     <w:p>
@@ -5003,7 +5108,11 @@
         <w:pStyle w:val="berschrift2"/>
       </w:pPr>
       <w:r>
-        <w:t>7.1 Addressing and ports</w:t>
+        <w:lastRenderedPageBreak/>
+        <w:t>8</w:t>
+      </w:r>
+      <w:r>
+        <w:t>.1 Addressing and ports</w:t>
       </w:r>
     </w:p>
     <w:p>
@@ -5080,8 +5189,10 @@
         <w:pStyle w:val="berschrift2"/>
       </w:pPr>
       <w:r>
-        <w:lastRenderedPageBreak/>
-        <w:t>7.2 Message flow</w:t>
+        <w:t>8</w:t>
+      </w:r>
+      <w:r>
+        <w:t>.2 Message flow</w:t>
       </w:r>
     </w:p>
     <w:p>
@@ -5206,7 +5317,10 @@
         <w:pStyle w:val="berschrift2"/>
       </w:pPr>
       <w:r>
-        <w:t>7.3 Recommended communication test</w:t>
+        <w:t>8</w:t>
+      </w:r>
+      <w:r>
+        <w:t>.3 Recommended communication test</w:t>
       </w:r>
     </w:p>
     <w:p>
@@ -5330,7 +5444,10 @@
         <w:pStyle w:val="berschrift2"/>
       </w:pPr>
       <w:r>
-        <w:t>7.4 Which MATLAB script should be used?</w:t>
+        <w:t>8</w:t>
+      </w:r>
+      <w:r>
+        <w:t>.4 Which MATLAB script should be used?</w:t>
       </w:r>
     </w:p>
     <w:tbl>
@@ -5522,7 +5639,8 @@
         <w:pStyle w:val="berschrift1"/>
       </w:pPr>
       <w:r>
-        <w:t>8</w:t>
+        <w:lastRenderedPageBreak/>
+        <w:t>9</w:t>
       </w:r>
       <w:r>
         <w:t>. Adding instruments and audio-system connection</w:t>
@@ -5584,133 +5702,154 @@
         <w:t>`.</w:t>
       </w:r>
     </w:p>
-    <w:p/>
+    <w:p>
+      <w:r>
+        <w:t xml:space="preserve">The 'icons' folder contains </w:t>
+      </w:r>
+      <w:proofErr w:type="gramStart"/>
+      <w:r>
+        <w:t>the image</w:t>
+      </w:r>
+      <w:proofErr w:type="gramEnd"/>
+      <w:r>
+        <w:t xml:space="preserve"> files for all GUI tiles. When a new instrument is added, the system automatically checks whether a suitable image for that instrument exists in this folder. It selects the first image that includes the full instrument name in its title.</w:t>
+      </w:r>
+      <w:r>
+        <w:t xml:space="preserve"> </w:t>
+      </w:r>
+      <w:r>
+        <w:t>You can add images there. If you do so, make sure they are square and measure approximately 100x100 to 300x300 pixels.</w:t>
+      </w:r>
+    </w:p>
     <w:p>
       <w:pPr>
         <w:pStyle w:val="berschrift1"/>
       </w:pPr>
       <w:r>
-        <w:lastRenderedPageBreak/>
-        <w:t>9</w:t>
+        <w:t>10</w:t>
       </w:r>
       <w:r>
         <w:t xml:space="preserve">. </w:t>
       </w:r>
-      <w:r>
-        <w:t xml:space="preserve">Adjust hand grabbing detection </w:t>
-      </w:r>
-    </w:p>
-    <w:p/>
-    <w:p>
-      <w:r>
-        <w:t xml:space="preserve">Use </w:t>
-      </w:r>
-      <w:r>
-        <w:t>‘</w:t>
-      </w:r>
       <w:proofErr w:type="spellStart"/>
       <w:r>
-        <w:t>grab_detection_methode</w:t>
+        <w:t>Adjrust</w:t>
       </w:r>
       <w:proofErr w:type="spellEnd"/>
       <w:r>
-        <w:t>’</w:t>
-      </w:r>
-      <w:r>
         <w:t xml:space="preserve"> </w:t>
       </w:r>
       <w:r>
-        <w:t xml:space="preserve">to set the static or dynamic hand-detection method. If you wish to modify the dynamic hand-detection method, focus on parameters </w:t>
-      </w:r>
-      <w:r>
-        <w:t>‘</w:t>
-      </w:r>
-      <w:proofErr w:type="spellStart"/>
-      <w:r>
-        <w:t>dynamic_grab_distance_difference</w:t>
-      </w:r>
-      <w:proofErr w:type="spellEnd"/>
-      <w:r>
-        <w:t>’ and ‘</w:t>
-      </w:r>
-      <w:proofErr w:type="spellStart"/>
-      <w:r>
-        <w:t>dynamic_grab_time_difference</w:t>
-      </w:r>
-      <w:proofErr w:type="spellEnd"/>
-      <w:r>
-        <w:t>’</w:t>
-      </w:r>
-      <w:r>
-        <w:t>.</w:t>
+        <w:t>GUI menu tiles and information</w:t>
       </w:r>
     </w:p>
     <w:p>
       <w:r>
-        <w:t>I</w:t>
-      </w:r>
-      <w:r>
-        <w:t xml:space="preserve">f you wish to modify the static hand-detection method, focus on parameters </w:t>
+        <w:t xml:space="preserve">The image </w:t>
       </w:r>
       <w:r>
         <w:t>‘</w:t>
       </w:r>
-      <w:proofErr w:type="spellStart"/>
-      <w:r>
-        <w:t>hand_status_buffer_size</w:t>
-      </w:r>
-      <w:proofErr w:type="spellEnd"/>
+      <w:r>
+        <w:t>info_window.png</w:t>
+      </w:r>
+      <w:r>
+        <w:t>’</w:t>
+      </w:r>
+      <w:r>
+        <w:t xml:space="preserve"> contains the information displayed in the info window, which is opened either by the info gesture</w:t>
+      </w:r>
+      <w:r>
+        <w:t>, info button</w:t>
+      </w:r>
+      <w:r>
+        <w:t xml:space="preserve"> or by pressing the I key. The icons for the instrument menu and the info button </w:t>
+      </w:r>
       <w:proofErr w:type="gramStart"/>
       <w:r>
-        <w:t>’ ,</w:t>
+        <w:t>are located in</w:t>
       </w:r>
       <w:proofErr w:type="gramEnd"/>
       <w:r>
-        <w:t xml:space="preserve"> ‘</w:t>
-      </w:r>
-      <w:proofErr w:type="spellStart"/>
-      <w:r>
-        <w:t>hand_status_buffer_atleast</w:t>
-      </w:r>
-      <w:proofErr w:type="spellEnd"/>
-      <w:proofErr w:type="gramStart"/>
-      <w:r>
-        <w:t>’, ‘</w:t>
-      </w:r>
-      <w:proofErr w:type="spellStart"/>
-      <w:proofErr w:type="gramEnd"/>
-      <w:r>
-        <w:t>hand_open_thrashold</w:t>
-      </w:r>
-      <w:proofErr w:type="spellEnd"/>
-      <w:r>
-        <w:t>’ and ‘</w:t>
-      </w:r>
-      <w:proofErr w:type="spellStart"/>
-      <w:r>
-        <w:t>hand_close_thrashold</w:t>
-      </w:r>
-      <w:proofErr w:type="spellEnd"/>
+        <w:t xml:space="preserve"> the icons folder. If you want to adjust any of them</w:t>
+      </w:r>
+      <w:r>
+        <w:t xml:space="preserve">, </w:t>
+      </w:r>
+      <w:r>
+        <w:t>in particular</w:t>
+      </w:r>
+      <w:r>
+        <w:t xml:space="preserve"> the info window</w:t>
+      </w:r>
+      <w:r>
+        <w:t xml:space="preserve">, it is recommended to use the raw files in the </w:t>
+      </w:r>
+      <w:r>
+        <w:t>‘</w:t>
+      </w:r>
+      <w:r>
+        <w:t>appendix</w:t>
+      </w:r>
       <w:r>
         <w:t>’</w:t>
       </w:r>
       <w:r>
-        <w:t>.</w:t>
+        <w:t xml:space="preserve"> folder to create new PNG files.</w:t>
+      </w:r>
+      <w:r>
+        <w:t xml:space="preserve"> I used the free </w:t>
+      </w:r>
+      <w:r>
+        <w:t>image editing software</w:t>
+      </w:r>
+      <w:r>
+        <w:t xml:space="preserve"> </w:t>
+      </w:r>
+      <w:r>
+        <w:t>‘panit.net’.</w:t>
       </w:r>
     </w:p>
     <w:p>
       <w:r>
-        <w:t>These are described in greater detail in section 6.</w:t>
+        <w:t xml:space="preserve">The volume bar is generated dynamically from text within the </w:t>
+      </w:r>
+      <w:r>
+        <w:t>‘</w:t>
+      </w:r>
+      <w:proofErr w:type="spellStart"/>
+      <w:r>
+        <w:t>VolumeBar</w:t>
+      </w:r>
+      <w:proofErr w:type="spellEnd"/>
+      <w:r>
+        <w:t>’</w:t>
+      </w:r>
+      <w:r>
+        <w:t xml:space="preserve"> class in the </w:t>
+      </w:r>
+      <w:r>
+        <w:t>‘</w:t>
+      </w:r>
+      <w:r>
+        <w:t>GUI.py</w:t>
+      </w:r>
+      <w:r>
+        <w:t>’</w:t>
+      </w:r>
+      <w:r>
+        <w:t xml:space="preserve"> file.</w:t>
       </w:r>
     </w:p>
-    <w:p/>
-    <w:p/>
     <w:p>
       <w:pPr>
         <w:pStyle w:val="berschrift1"/>
       </w:pPr>
       <w:r>
-        <w:t>9</w:t>
+        <w:t>1</w:t>
+      </w:r>
+      <w:r>
+        <w:t>1</w:t>
       </w:r>
       <w:r>
         <w:t>. Operational caveats</w:t>

</xml_diff>